<commit_message>
Update manuscript data availability statement
</commit_message>
<xml_diff>
--- a/paper/submission/graphical_abstract_text.docx
+++ b/paper/submission/graphical_abstract_text.docx
@@ -507,7 +507,7 @@
       <w:spacing w:line="288" w:lineRule="auto" w:after="240"/>
     </w:pPr>
     <w:rPr>
-      <w:rFonts w:ascii="Times New Roman" w:hAnsi="Times New Roman"/>
+      <w:rFonts w:ascii="Times New Roman" w:hAnsi="Times New Roman" w:cs="Times New Roman" w:eastAsia="Times New Roman"/>
       <w:color w:val="000000"/>
       <w:sz w:val="24"/>
     </w:rPr>
@@ -854,14 +854,11 @@
     <w:rsid w:val="00FC693F"/>
     <w:pPr>
       <w:keepNext/>
-      <w:pBdr>
-        <w:bottom w:val="single" w:sz="8" w:space="4" w:color="4F81BD" w:themeColor="accent1"/>
-      </w:pBdr>
       <w:spacing w:after="320" w:line="264" w:lineRule="auto"/>
       <w:contextualSpacing/>
     </w:pPr>
     <w:rPr>
-      <w:rFonts w:asciiTheme="majorHAnsi" w:eastAsiaTheme="majorEastAsia" w:hAnsiTheme="majorHAnsi" w:cstheme="majorBidi" w:ascii="Times New Roman" w:hAnsi="Times New Roman"/>
+      <w:rFonts w:ascii="Times New Roman" w:hAnsi="Times New Roman" w:cs="Times New Roman" w:eastAsia="Times New Roman"/>
       <w:b/>
       <w:color w:val="000000"/>
       <w:spacing w:val="5"/>
@@ -1342,9 +1339,6 @@
     <w:qFormat/>
     <w:rsid w:val="00FC693F"/>
     <w:pPr>
-      <w:pBdr>
-        <w:bottom w:val="single" w:sz="4" w:space="4" w:color="4F81BD" w:themeColor="accent1"/>
-      </w:pBdr>
       <w:spacing w:before="200" w:after="280"/>
       <w:ind w:left="936" w:right="936"/>
     </w:pPr>

</xml_diff>